<commit_message>
Update CV documents (PDF and DOCX)
</commit_message>
<xml_diff>
--- a/public/docs/MuthuKarthik-CV.docx
+++ b/public/docs/MuthuKarthik-CV.docx
@@ -1,6 +1,6 @@
 
 <file path=word/document.xml><?xml version="1.0" encoding="utf-8"?>
-<w:document xmlns:wpc="http://schemas.microsoft.com/office/word/2010/wordprocessingCanvas" xmlns:cx="http://schemas.microsoft.com/office/drawing/2014/chartex" xmlns:cx1="http://schemas.microsoft.com/office/drawing/2015/9/8/chartex" xmlns:cx2="http://schemas.microsoft.com/office/drawing/2015/10/21/chartex" xmlns:cx3="http://schemas.microsoft.com/office/drawing/2016/5/9/chartex" xmlns:cx4="http://schemas.microsoft.com/office/drawing/2016/5/10/chartex" xmlns:cx5="http://schemas.microsoft.com/office/drawing/2016/5/11/chartex" xmlns:cx6="http://schemas.microsoft.com/office/drawing/2016/5/12/chartex" xmlns:cx7="http://schemas.microsoft.com/office/drawing/2016/5/13/chartex" xmlns:cx8="http://schemas.microsoft.com/office/drawing/2016/5/14/chartex" xmlns:mc="http://schemas.openxmlformats.org/markup-compatibility/2006" xmlns:aink="http://schemas.microsoft.com/office/drawing/2016/ink" xmlns:am3d="http://schemas.microsoft.com/office/drawing/2017/model3d" xmlns:o="urn:schemas-microsoft-com:office:office" xmlns:oel="http://schemas.microsoft.com/office/2019/extlst" xmlns:r="http://schemas.openxmlformats.org/officeDocument/2006/relationships" xmlns:m="http://schemas.openxmlformats.org/officeDocument/2006/math" xmlns:v="urn:schemas-microsoft-com:vml" xmlns:wp14="http://schemas.microsoft.com/office/word/2010/wordprocessingDrawing" xmlns:wp="http://schemas.openxmlformats.org/drawingml/2006/wordprocessingDrawing" xmlns:w10="urn:schemas-microsoft-com:office:word" xmlns:w="http://schemas.openxmlformats.org/wordprocessingml/2006/main" xmlns:w14="http://schemas.microsoft.com/office/word/2010/wordml" xmlns:w15="http://schemas.microsoft.com/office/word/2012/wordml" xmlns:w16cei="http://schemas.microsoft.com/office/word/2026/wordml/cei" xmlns:w16cex="http://schemas.microsoft.com/office/word/2018/wordml/cex" xmlns:w16cid="http://schemas.microsoft.com/office/word/2016/wordml/cid" xmlns:w16="http://schemas.microsoft.com/office/word/2018/wordml" xmlns:w16du="http://schemas.microsoft.com/office/word/2023/wordml/word16du" xmlns:w16sdtdh="http://schemas.microsoft.com/office/word/2020/wordml/sdtdatahash" xmlns:w16sdtfl="http://schemas.microsoft.com/office/word/2024/wordml/sdtformatlock" xmlns:w16se="http://schemas.microsoft.com/office/word/2015/wordml/symex" xmlns:wpg="http://schemas.microsoft.com/office/word/2010/wordprocessingGroup" xmlns:wpi="http://schemas.microsoft.com/office/word/2010/wordprocessingInk" xmlns:wne="http://schemas.microsoft.com/office/word/2006/wordml" xmlns:wps="http://schemas.microsoft.com/office/word/2010/wordprocessingShape" mc:Ignorable="w14 w15 w16se w16cid w16 w16cex w16sdtdh w16sdtfl w16du wp14">
+<w:document xmlns:wpc="http://schemas.microsoft.com/office/word/2010/wordprocessingCanvas" xmlns:cx="http://schemas.microsoft.com/office/drawing/2014/chartex" xmlns:cx1="http://schemas.microsoft.com/office/drawing/2015/9/8/chartex" xmlns:cx2="http://schemas.microsoft.com/office/drawing/2015/10/21/chartex" xmlns:cx3="http://schemas.microsoft.com/office/drawing/2016/5/9/chartex" xmlns:cx4="http://schemas.microsoft.com/office/drawing/2016/5/10/chartex" xmlns:cx5="http://schemas.microsoft.com/office/drawing/2016/5/11/chartex" xmlns:cx6="http://schemas.microsoft.com/office/drawing/2016/5/12/chartex" xmlns:cx7="http://schemas.microsoft.com/office/drawing/2016/5/13/chartex" xmlns:cx8="http://schemas.microsoft.com/office/drawing/2016/5/14/chartex" xmlns:mc="http://schemas.openxmlformats.org/markup-compatibility/2006" xmlns:aink="http://schemas.microsoft.com/office/drawing/2016/ink" xmlns:am3d="http://schemas.microsoft.com/office/drawing/2017/model3d" xmlns:o="urn:schemas-microsoft-com:office:office" xmlns:oel="http://schemas.microsoft.com/office/2019/extlst" xmlns:r="http://schemas.openxmlformats.org/officeDocument/2006/relationships" xmlns:m="http://schemas.openxmlformats.org/officeDocument/2006/math" xmlns:v="urn:schemas-microsoft-com:vml" xmlns:wp14="http://schemas.microsoft.com/office/word/2010/wordprocessingDrawing" xmlns:wp="http://schemas.openxmlformats.org/drawingml/2006/wordprocessingDrawing" xmlns:w10="urn:schemas-microsoft-com:office:word" xmlns:w="http://schemas.openxmlformats.org/wordprocessingml/2006/main" xmlns:w14="http://schemas.microsoft.com/office/word/2010/wordml" xmlns:w15="http://schemas.microsoft.com/office/word/2012/wordml" xmlns:w16cex="http://schemas.microsoft.com/office/word/2018/wordml/cex" xmlns:w16cid="http://schemas.microsoft.com/office/word/2016/wordml/cid" xmlns:w16="http://schemas.microsoft.com/office/word/2018/wordml" xmlns:w16du="http://schemas.microsoft.com/office/word/2023/wordml/word16du" xmlns:w16sdtdh="http://schemas.microsoft.com/office/word/2020/wordml/sdtdatahash" xmlns:w16sdtfl="http://schemas.microsoft.com/office/word/2024/wordml/sdtformatlock" xmlns:w16se="http://schemas.microsoft.com/office/word/2015/wordml/symex" xmlns:wpg="http://schemas.microsoft.com/office/word/2010/wordprocessingGroup" xmlns:wpi="http://schemas.microsoft.com/office/word/2010/wordprocessingInk" xmlns:wne="http://schemas.microsoft.com/office/word/2006/wordml" xmlns:wps="http://schemas.microsoft.com/office/word/2010/wordprocessingShape" mc:Ignorable="w14 w15 w16se w16cid w16 w16cex w16sdtdh w16sdtfl w16du wp14">
   <w:body>
     <w:p>
       <w:pPr>
@@ -50,24 +50,49 @@
           <w:sz w:val="19"/>
           <w:szCs w:val="19"/>
         </w:rPr>
-        <w:t xml:space="preserve">+91-9976158821  |  </w:t>
-      </w:r>
-      <w:r>
-        <w:rPr>
-          <w:b/>
-          <w:bCs/>
-          <w:color w:val="1B2A4A"/>
+        <w:t>+91-</w:t>
+      </w:r>
+      <w:proofErr w:type="gramStart"/>
+      <w:r>
+        <w:rPr>
           <w:sz w:val="19"/>
           <w:szCs w:val="19"/>
         </w:rPr>
-        <w:t xml:space="preserve">Email: </w:t>
-      </w:r>
+        <w:t>9976158821  |</w:t>
+      </w:r>
+      <w:proofErr w:type="gramEnd"/>
       <w:r>
         <w:rPr>
           <w:sz w:val="19"/>
           <w:szCs w:val="19"/>
         </w:rPr>
-        <w:t xml:space="preserve">mr.muthukarthick@gmail.com  |  </w:t>
+        <w:t xml:space="preserve">  </w:t>
+      </w:r>
+      <w:r>
+        <w:rPr>
+          <w:b/>
+          <w:bCs/>
+          <w:color w:val="1B2A4A"/>
+          <w:sz w:val="19"/>
+          <w:szCs w:val="19"/>
+        </w:rPr>
+        <w:t xml:space="preserve">Email: </w:t>
+      </w:r>
+      <w:proofErr w:type="gramStart"/>
+      <w:r>
+        <w:rPr>
+          <w:sz w:val="19"/>
+          <w:szCs w:val="19"/>
+        </w:rPr>
+        <w:t>mr.muthukarthick@gmail.com  |</w:t>
+      </w:r>
+      <w:proofErr w:type="gramEnd"/>
+      <w:r>
+        <w:rPr>
+          <w:sz w:val="19"/>
+          <w:szCs w:val="19"/>
+        </w:rPr>
+        <w:t xml:space="preserve">  </w:t>
       </w:r>
       <w:r>
         <w:rPr>
@@ -109,18 +134,8 @@
             <w:sz w:val="19"/>
             <w:szCs w:val="19"/>
           </w:rPr>
-          <w:t>linkedin.com/in/</w:t>
+          <w:t>linkedin.com/in/mr-muthukarthick</w:t>
         </w:r>
-        <w:proofErr w:type="spellStart"/>
-        <w:r>
-          <w:rPr>
-            <w:color w:val="3366CC"/>
-            <w:sz w:val="19"/>
-            <w:szCs w:val="19"/>
-          </w:rPr>
-          <w:t>mr-muthukarthick</w:t>
-        </w:r>
-        <w:proofErr w:type="spellEnd"/>
       </w:hyperlink>
       <w:r>
         <w:rPr>
@@ -146,18 +161,57 @@
             <w:sz w:val="19"/>
             <w:szCs w:val="19"/>
           </w:rPr>
-          <w:t>github.com/</w:t>
+          <w:t>github.com/muthukarthick</w:t>
         </w:r>
-        <w:proofErr w:type="spellStart"/>
+      </w:hyperlink>
+      <w:r>
+        <w:t xml:space="preserve"> | </w:t>
+      </w:r>
+      <w:r>
+        <w:br/>
+      </w:r>
+      <w:r>
+        <w:rPr>
+          <w:b/>
+          <w:bCs/>
+          <w:color w:val="1B2A4A"/>
+          <w:sz w:val="19"/>
+          <w:szCs w:val="19"/>
+        </w:rPr>
+        <w:t>Portfolio</w:t>
+      </w:r>
+      <w:r>
+        <w:rPr>
+          <w:b/>
+          <w:bCs/>
+          <w:color w:val="1B2A4A"/>
+          <w:sz w:val="19"/>
+          <w:szCs w:val="19"/>
+        </w:rPr>
+        <w:t xml:space="preserve">: </w:t>
+      </w:r>
+      <w:hyperlink r:id="rId7" w:history="1">
         <w:r>
           <w:rPr>
-            <w:color w:val="3366CC"/>
-            <w:sz w:val="19"/>
-            <w:szCs w:val="19"/>
+            <w:rStyle w:val="Hyperlink"/>
+            <w:u w:val="none"/>
           </w:rPr>
-          <w:t>muthukarthick</w:t>
+          <w:t>muthukarthik-portfolio.verce</w:t>
         </w:r>
-        <w:proofErr w:type="spellEnd"/>
+        <w:r>
+          <w:rPr>
+            <w:rStyle w:val="Hyperlink"/>
+            <w:u w:val="none"/>
+          </w:rPr>
+          <w:t>l</w:t>
+        </w:r>
+        <w:r>
+          <w:rPr>
+            <w:rStyle w:val="Hyperlink"/>
+            <w:u w:val="none"/>
+          </w:rPr>
+          <w:t>.app</w:t>
+        </w:r>
       </w:hyperlink>
     </w:p>
     <w:p>
@@ -1433,7 +1487,7 @@
 </file>
 
 <file path=word/numbering.xml><?xml version="1.0" encoding="utf-8"?>
-<w:numbering xmlns:wpc="http://schemas.microsoft.com/office/word/2010/wordprocessingCanvas" xmlns:cx="http://schemas.microsoft.com/office/drawing/2014/chartex" xmlns:cx1="http://schemas.microsoft.com/office/drawing/2015/9/8/chartex" xmlns:cx2="http://schemas.microsoft.com/office/drawing/2015/10/21/chartex" xmlns:cx3="http://schemas.microsoft.com/office/drawing/2016/5/9/chartex" xmlns:cx4="http://schemas.microsoft.com/office/drawing/2016/5/10/chartex" xmlns:cx5="http://schemas.microsoft.com/office/drawing/2016/5/11/chartex" xmlns:cx6="http://schemas.microsoft.com/office/drawing/2016/5/12/chartex" xmlns:cx7="http://schemas.microsoft.com/office/drawing/2016/5/13/chartex" xmlns:cx8="http://schemas.microsoft.com/office/drawing/2016/5/14/chartex" xmlns:mc="http://schemas.openxmlformats.org/markup-compatibility/2006" xmlns:aink="http://schemas.microsoft.com/office/drawing/2016/ink" xmlns:am3d="http://schemas.microsoft.com/office/drawing/2017/model3d" xmlns:o="urn:schemas-microsoft-com:office:office" xmlns:oel="http://schemas.microsoft.com/office/2019/extlst" xmlns:r="http://schemas.openxmlformats.org/officeDocument/2006/relationships" xmlns:m="http://schemas.openxmlformats.org/officeDocument/2006/math" xmlns:v="urn:schemas-microsoft-com:vml" xmlns:wp14="http://schemas.microsoft.com/office/word/2010/wordprocessingDrawing" xmlns:wp="http://schemas.openxmlformats.org/drawingml/2006/wordprocessingDrawing" xmlns:w10="urn:schemas-microsoft-com:office:word" xmlns:w="http://schemas.openxmlformats.org/wordprocessingml/2006/main" xmlns:w14="http://schemas.microsoft.com/office/word/2010/wordml" xmlns:w15="http://schemas.microsoft.com/office/word/2012/wordml" xmlns:w16cei="http://schemas.microsoft.com/office/word/2026/wordml/cei" xmlns:w16cex="http://schemas.microsoft.com/office/word/2018/wordml/cex" xmlns:w16cid="http://schemas.microsoft.com/office/word/2016/wordml/cid" xmlns:w16="http://schemas.microsoft.com/office/word/2018/wordml" xmlns:w16du="http://schemas.microsoft.com/office/word/2023/wordml/word16du" xmlns:w16sdtdh="http://schemas.microsoft.com/office/word/2020/wordml/sdtdatahash" xmlns:w16sdtfl="http://schemas.microsoft.com/office/word/2024/wordml/sdtformatlock" xmlns:w16se="http://schemas.microsoft.com/office/word/2015/wordml/symex" xmlns:wpg="http://schemas.microsoft.com/office/word/2010/wordprocessingGroup" xmlns:wpi="http://schemas.microsoft.com/office/word/2010/wordprocessingInk" xmlns:wne="http://schemas.microsoft.com/office/word/2006/wordml" xmlns:wps="http://schemas.microsoft.com/office/word/2010/wordprocessingShape" mc:Ignorable="w14 w15 w16se w16cid w16 w16cex w16sdtdh w16sdtfl w16du wp14">
+<w:numbering xmlns:wpc="http://schemas.microsoft.com/office/word/2010/wordprocessingCanvas" xmlns:cx="http://schemas.microsoft.com/office/drawing/2014/chartex" xmlns:cx1="http://schemas.microsoft.com/office/drawing/2015/9/8/chartex" xmlns:cx2="http://schemas.microsoft.com/office/drawing/2015/10/21/chartex" xmlns:cx3="http://schemas.microsoft.com/office/drawing/2016/5/9/chartex" xmlns:cx4="http://schemas.microsoft.com/office/drawing/2016/5/10/chartex" xmlns:cx5="http://schemas.microsoft.com/office/drawing/2016/5/11/chartex" xmlns:cx6="http://schemas.microsoft.com/office/drawing/2016/5/12/chartex" xmlns:cx7="http://schemas.microsoft.com/office/drawing/2016/5/13/chartex" xmlns:cx8="http://schemas.microsoft.com/office/drawing/2016/5/14/chartex" xmlns:mc="http://schemas.openxmlformats.org/markup-compatibility/2006" xmlns:aink="http://schemas.microsoft.com/office/drawing/2016/ink" xmlns:am3d="http://schemas.microsoft.com/office/drawing/2017/model3d" xmlns:o="urn:schemas-microsoft-com:office:office" xmlns:oel="http://schemas.microsoft.com/office/2019/extlst" xmlns:r="http://schemas.openxmlformats.org/officeDocument/2006/relationships" xmlns:m="http://schemas.openxmlformats.org/officeDocument/2006/math" xmlns:v="urn:schemas-microsoft-com:vml" xmlns:wp14="http://schemas.microsoft.com/office/word/2010/wordprocessingDrawing" xmlns:wp="http://schemas.openxmlformats.org/drawingml/2006/wordprocessingDrawing" xmlns:w10="urn:schemas-microsoft-com:office:word" xmlns:w="http://schemas.openxmlformats.org/wordprocessingml/2006/main" xmlns:w14="http://schemas.microsoft.com/office/word/2010/wordml" xmlns:w15="http://schemas.microsoft.com/office/word/2012/wordml" xmlns:w16cex="http://schemas.microsoft.com/office/word/2018/wordml/cex" xmlns:w16cid="http://schemas.microsoft.com/office/word/2016/wordml/cid" xmlns:w16="http://schemas.microsoft.com/office/word/2018/wordml" xmlns:w16du="http://schemas.microsoft.com/office/word/2023/wordml/word16du" xmlns:w16sdtdh="http://schemas.microsoft.com/office/word/2020/wordml/sdtdatahash" xmlns:w16sdtfl="http://schemas.microsoft.com/office/word/2024/wordml/sdtformatlock" xmlns:w16se="http://schemas.microsoft.com/office/word/2015/wordml/symex" xmlns:wpg="http://schemas.microsoft.com/office/word/2010/wordprocessingGroup" xmlns:wpi="http://schemas.microsoft.com/office/word/2010/wordprocessingInk" xmlns:wne="http://schemas.microsoft.com/office/word/2006/wordml" xmlns:wps="http://schemas.microsoft.com/office/word/2010/wordprocessingShape" mc:Ignorable="w14 w15 w16se w16cid w16 w16cex w16sdtdh w16sdtfl w16du wp14">
   <w:abstractNum w:abstractNumId="0" w15:restartNumberingAfterBreak="0">
     <w:nsid w:val="02260CF9"/>
     <w:multiLevelType w:val="hybridMultilevel"/>
@@ -2181,6 +2235,30 @@
       <w:szCs w:val="20"/>
     </w:rPr>
   </w:style>
+  <w:style w:type="character" w:styleId="UnresolvedMention">
+    <w:name w:val="Unresolved Mention"/>
+    <w:basedOn w:val="DefaultParagraphFont"/>
+    <w:uiPriority w:val="99"/>
+    <w:semiHidden/>
+    <w:unhideWhenUsed/>
+    <w:rsid w:val="009B6764"/>
+    <w:rPr>
+      <w:color w:val="605E5C"/>
+      <w:shd w:val="clear" w:color="auto" w:fill="E1DFDD"/>
+    </w:rPr>
+  </w:style>
+  <w:style w:type="character" w:styleId="FollowedHyperlink">
+    <w:name w:val="FollowedHyperlink"/>
+    <w:basedOn w:val="DefaultParagraphFont"/>
+    <w:uiPriority w:val="99"/>
+    <w:semiHidden/>
+    <w:unhideWhenUsed/>
+    <w:rsid w:val="009B6764"/>
+    <w:rPr>
+      <w:color w:val="954F72" w:themeColor="followedHyperlink"/>
+      <w:u w:val="single"/>
+    </w:rPr>
+  </w:style>
 </w:styles>
 </file>
 

</xml_diff>